<commit_message>
Redraw the Chapter 4 figures so no text overlaps
Boxes are now measured, not guessed: each node draws its text, measures the
drawn text with the renderer, and sizes the box around it, so a label can
never spill over a neighbour. Rows of boxes are packed from those measured
widths, the feedback line in the design loop and the fan-out in the data
pipeline are routed down clear lanes, and arrow labels sit on empty space
rather than on box text.

Each part of the system also keeps one colour across all five figures:
slate for the user's input, blue for the detector, purple for the attention
cues, orange for the generator, teal for prompt building, green for output,
indigo for a process step, brown for the raw corpus and red for the decision
point.

Co-Authored-By: Claude Opus 5 (1M context) <noreply@anthropic.com>
</commit_message>
<xml_diff>
--- a/final writing/Chapter_4_Proposed_Methodology.docx
+++ b/final writing/Chapter_4_Proposed_Methodology.docx
@@ -65,7 +65,7 @@
       <w:r>
         <w:drawing>
           <wp:inline xmlns:a="http://schemas.openxmlformats.org/drawingml/2006/main" xmlns:pic="http://schemas.openxmlformats.org/drawingml/2006/picture">
-            <wp:extent cx="5486400" cy="1511523"/>
+            <wp:extent cx="5486400" cy="6388608"/>
             <wp:docPr id="1" name="Picture 1"/>
             <wp:cNvGraphicFramePr>
               <a:graphicFrameLocks noChangeAspect="1"/>
@@ -86,7 +86,7 @@
                   <pic:spPr>
                     <a:xfrm>
                       <a:off x="0" y="0"/>
-                      <a:ext cx="5486400" cy="1511523"/>
+                      <a:ext cx="5486400" cy="6388608"/>
                     </a:xfrm>
                     <a:prstGeom prst="rect"/>
                   </pic:spPr>
@@ -204,7 +204,7 @@
       <w:r>
         <w:drawing>
           <wp:inline xmlns:a="http://schemas.openxmlformats.org/drawingml/2006/main" xmlns:pic="http://schemas.openxmlformats.org/drawingml/2006/picture">
-            <wp:extent cx="5486400" cy="2711712"/>
+            <wp:extent cx="5486400" cy="6044433"/>
             <wp:docPr id="2" name="Picture 2"/>
             <wp:cNvGraphicFramePr>
               <a:graphicFrameLocks noChangeAspect="1"/>
@@ -225,7 +225,7 @@
                   <pic:spPr>
                     <a:xfrm>
                       <a:off x="0" y="0"/>
-                      <a:ext cx="5486400" cy="2711712"/>
+                      <a:ext cx="5486400" cy="6044433"/>
                     </a:xfrm>
                     <a:prstGeom prst="rect"/>
                   </pic:spPr>
@@ -2335,7 +2335,7 @@
       <w:r>
         <w:drawing>
           <wp:inline xmlns:a="http://schemas.openxmlformats.org/drawingml/2006/main" xmlns:pic="http://schemas.openxmlformats.org/drawingml/2006/picture">
-            <wp:extent cx="5486400" cy="2141215"/>
+            <wp:extent cx="5486400" cy="3305770"/>
             <wp:docPr id="3" name="Picture 3"/>
             <wp:cNvGraphicFramePr>
               <a:graphicFrameLocks noChangeAspect="1"/>
@@ -2356,7 +2356,7 @@
                   <pic:spPr>
                     <a:xfrm>
                       <a:off x="0" y="0"/>
-                      <a:ext cx="5486400" cy="2141215"/>
+                      <a:ext cx="5486400" cy="3305770"/>
                     </a:xfrm>
                     <a:prstGeom prst="rect"/>
                   </pic:spPr>
@@ -2822,7 +2822,7 @@
       <w:r>
         <w:drawing>
           <wp:inline xmlns:a="http://schemas.openxmlformats.org/drawingml/2006/main" xmlns:pic="http://schemas.openxmlformats.org/drawingml/2006/picture">
-            <wp:extent cx="5486400" cy="2826552"/>
+            <wp:extent cx="5486400" cy="3964781"/>
             <wp:docPr id="4" name="Picture 4"/>
             <wp:cNvGraphicFramePr>
               <a:graphicFrameLocks noChangeAspect="1"/>
@@ -2843,7 +2843,7 @@
                   <pic:spPr>
                     <a:xfrm>
                       <a:off x="0" y="0"/>
-                      <a:ext cx="5486400" cy="2826552"/>
+                      <a:ext cx="5486400" cy="3964781"/>
                     </a:xfrm>
                     <a:prstGeom prst="rect"/>
                   </pic:spPr>
@@ -2905,7 +2905,7 @@
       <w:r>
         <w:drawing>
           <wp:inline xmlns:a="http://schemas.openxmlformats.org/drawingml/2006/main" xmlns:pic="http://schemas.openxmlformats.org/drawingml/2006/picture">
-            <wp:extent cx="5486400" cy="2431143"/>
+            <wp:extent cx="5486400" cy="3632597"/>
             <wp:docPr id="5" name="Picture 5"/>
             <wp:cNvGraphicFramePr>
               <a:graphicFrameLocks noChangeAspect="1"/>
@@ -2926,7 +2926,7 @@
                   <pic:spPr>
                     <a:xfrm>
                       <a:off x="0" y="0"/>
-                      <a:ext cx="5486400" cy="2431143"/>
+                      <a:ext cx="5486400" cy="3632597"/>
                     </a:xfrm>
                     <a:prstGeom prst="rect"/>
                   </pic:spPr>

</xml_diff>